<commit_message>
Teksten: start via .exe en Communicator 5 werkt ook op volledig scherm
- Dashboard, live-melding en handleiding zeggen niet langer dat
  Vensterweergave nodig is (alleen nog als tip bij stilstaand beeld).
- Handleiding en voorleesscript: onedir start je met MimiControl Studio v2.exe;
  Studio vraagt zelf om herstart als beheerder.
- docs/video/PROMPT-opus-video.md: opdracht voor Opus 5.5 om een
  professionelere uitlegvideo te maken.

Co-Authored-By: Claude Sonnet 5.5 <noreply@anthropic.com>
</commit_message>
<xml_diff>
--- a/docs/Handleiding-MimiControl-Studio-v2.docx
+++ b/docs/Handleiding-MimiControl-Studio-v2.docx
@@ -249,13 +249,13 @@
           <w:b/>
           <w:bCs/>
         </w:rPr>
-        <w:t xml:space="preserve">Start MimiControl Studio v2.bat</w:t>
-      </w:r>
-      <w:r>
-        <w:rPr>
-          <w:rFonts w:ascii="Calibri" w:cs="Calibri" w:eastAsia="Calibri" w:hAnsi="Calibri"/>
-        </w:rPr>
-        <w:t xml:space="preserve"> in de map van Studio (niet alleen op het .exe-bestand).</w:t>
+        <w:t xml:space="preserve">MimiControl Studio v2.exe</w:t>
+      </w:r>
+      <w:r>
+        <w:rPr>
+          <w:rFonts w:ascii="Calibri" w:cs="Calibri" w:eastAsia="Calibri" w:hAnsi="Calibri"/>
+        </w:rPr>
+        <w:t xml:space="preserve"> in de map van Studio.</w:t>
       </w:r>
     </w:p>
     <w:p>
@@ -271,7 +271,7 @@
         <w:rPr>
           <w:rFonts w:ascii="Calibri" w:cs="Calibri" w:eastAsia="Calibri" w:hAnsi="Calibri"/>
         </w:rPr>
-        <w:t xml:space="preserve">Windows vraagt of Studio wijzigingen mag aanbrengen. Klik op </w:t>
+        <w:t xml:space="preserve">Studio vraagt of het opnieuw mag starten als beheerder. Klik op </w:t>
       </w:r>
       <w:r>
         <w:rPr>
@@ -285,7 +285,21 @@
         <w:rPr>
           <w:rFonts w:ascii="Calibri" w:cs="Calibri" w:eastAsia="Calibri" w:hAnsi="Calibri"/>
         </w:rPr>
-        <w:t xml:space="preserve">. Dat is nodig: Communicator 5 draait met extra rechten, en alleen dan komen de toetsen van Studio daar binnen.</w:t>
+        <w:t xml:space="preserve"> en daarna op </w:t>
+      </w:r>
+      <w:r>
+        <w:rPr>
+          <w:rFonts w:ascii="Calibri" w:cs="Calibri" w:eastAsia="Calibri" w:hAnsi="Calibri"/>
+          <w:b/>
+          <w:bCs/>
+        </w:rPr>
+        <w:t xml:space="preserve">Ja</w:t>
+      </w:r>
+      <w:r>
+        <w:rPr>
+          <w:rFonts w:ascii="Calibri" w:cs="Calibri" w:eastAsia="Calibri" w:hAnsi="Calibri"/>
+        </w:rPr>
+        <w:t xml:space="preserve"> bij de Windows-melding. Dat is nodig: Communicator 5 draait met extra rechten, en alleen dan komen de toetsen van Studio daar binnen.</w:t>
       </w:r>
     </w:p>
     <w:p>
@@ -495,7 +509,7 @@
               <w:rPr>
                 <w:rFonts w:ascii="Calibri" w:cs="Calibri" w:eastAsia="Calibri" w:hAnsi="Calibri"/>
               </w:rPr>
-              <w:t xml:space="preserve">•  Staat er ✗ Beheerder: nee? Sluit Studio en start opnieuw. Kies bij de Windows-melding Ja.</w:t>
+              <w:t xml:space="preserve">•  Staat er ✗ Beheerder: nee? Sluit Studio en start opnieuw. Kies bij de vraag over beheerder Ja.</w:t>
             </w:r>
           </w:p>
           <w:p>
@@ -1256,7 +1270,7 @@
         <w:rPr>
           <w:rFonts w:ascii="Calibri" w:cs="Calibri" w:eastAsia="Calibri" w:hAnsi="Calibri"/>
         </w:rPr>
-        <w:t xml:space="preserve">Zet Communicator 5 op </w:t>
+        <w:t xml:space="preserve">Klik in Studio op </w:t>
       </w:r>
       <w:r>
         <w:rPr>
@@ -1264,13 +1278,13 @@
           <w:b/>
           <w:bCs/>
         </w:rPr>
-        <w:t xml:space="preserve">Vensterweergave</w:t>
-      </w:r>
-      <w:r>
-        <w:rPr>
-          <w:rFonts w:ascii="Calibri" w:cs="Calibri" w:eastAsia="Calibri" w:hAnsi="Calibri"/>
-        </w:rPr>
-        <w:t xml:space="preserve"> (niet op volledig scherm). Dat voorkomt dat het camerabeeld blijft hangen.</w:t>
+        <w:t xml:space="preserve">Live modus starten</w:t>
+      </w:r>
+      <w:r>
+        <w:rPr>
+          <w:rFonts w:ascii="Calibri" w:cs="Calibri" w:eastAsia="Calibri" w:hAnsi="Calibri"/>
+        </w:rPr>
+        <w:t xml:space="preserve">. Er verschijnt een klein camerabeeld in de hoek van je scherm.</w:t>
       </w:r>
     </w:p>
     <w:p>
@@ -1286,7 +1300,7 @@
         <w:rPr>
           <w:rFonts w:ascii="Calibri" w:cs="Calibri" w:eastAsia="Calibri" w:hAnsi="Calibri"/>
         </w:rPr>
-        <w:t xml:space="preserve">Klik in Studio op </w:t>
+        <w:t xml:space="preserve">Klik op Communicator 5, zodat dat het </w:t>
       </w:r>
       <w:r>
         <w:rPr>
@@ -1294,43 +1308,13 @@
           <w:b/>
           <w:bCs/>
         </w:rPr>
-        <w:t xml:space="preserve">Live modus starten</w:t>
-      </w:r>
-      <w:r>
-        <w:rPr>
-          <w:rFonts w:ascii="Calibri" w:cs="Calibri" w:eastAsia="Calibri" w:hAnsi="Calibri"/>
-        </w:rPr>
-        <w:t xml:space="preserve">.</w:t>
-      </w:r>
-    </w:p>
-    <w:p>
-      <w:pPr>
-        <w:pStyle w:val="ListParagraph"/>
-        <w:numPr>
-          <w:ilvl w:val="0"/>
-          <w:numId w:val="6"/>
-        </w:numPr>
-        <w:spacing w:after="100" w:line="288"/>
-      </w:pPr>
-      <w:r>
-        <w:rPr>
-          <w:rFonts w:ascii="Calibri" w:cs="Calibri" w:eastAsia="Calibri" w:hAnsi="Calibri"/>
-        </w:rPr>
-        <w:t xml:space="preserve">Klik op Communicator 5, zodat dat het </w:t>
-      </w:r>
-      <w:r>
-        <w:rPr>
-          <w:rFonts w:ascii="Calibri" w:cs="Calibri" w:eastAsia="Calibri" w:hAnsi="Calibri"/>
-          <w:b/>
-          <w:bCs/>
-        </w:rPr>
         <w:t xml:space="preserve">actieve venster</w:t>
       </w:r>
       <w:r>
         <w:rPr>
           <w:rFonts w:ascii="Calibri" w:cs="Calibri" w:eastAsia="Calibri" w:hAnsi="Calibri"/>
         </w:rPr>
-        <w:t xml:space="preserve"> is. Studio drukt de toetsen altijd in het actieve venster in.</w:t>
+        <w:t xml:space="preserve"> is. Studio drukt de toetsen altijd in het actieve venster in. Communicator 5 mag ook op volledig scherm staan.</w:t>
       </w:r>
     </w:p>
     <w:p>
@@ -2451,7 +2435,7 @@
                 <w:sz w:val="21"/>
                 <w:szCs w:val="21"/>
               </w:rPr>
-              <w:t xml:space="preserve">Communicator staat op volledig scherm.</w:t>
+              <w:t xml:space="preserve">Soms houdt een programma op volledig scherm het beeld tegen.</w:t>
             </w:r>
           </w:p>
         </w:tc>

</xml_diff>